<commit_message>
Merge game_01 and update monthly submission
</commit_message>
<xml_diff>
--- a/project/monthly_submission_docs/LE3C_15_チハラ_シゴウ_プログラム説明資料.docx
+++ b/project/monthly_submission_docs/LE3C_15_チハラ_シゴウ_プログラム説明資料.docx
@@ -4,1139 +4,844 @@
   <w:body>
     <w:p>
       <w:pPr>
-        <w:spacing w:after="80"/>
+        <w:spacing w:before="1160"/>
       </w:pPr>
       <w:r>
         <w:rPr>
           <w:rFonts w:ascii="Calibri" w:hAnsi="Calibri" w:eastAsia="Yu Gothic"/>
           <w:b/>
-          <w:color w:val="141F2B"/>
-          <w:sz w:val="44"/>
+          <w:color w:val="1991AA"/>
+          <w:sz w:val="24"/>
         </w:rPr>
-        <w:t>トラブル・シューティング プログラム説明資料</w:t>
+        <w:t>PROGRAM DOCUMENT</w:t>
       </w:r>
     </w:p>
     <w:p>
       <w:pPr>
-        <w:spacing w:after="280"/>
+        <w:spacing w:before="200"/>
+        <w:pBdr>
+          <w:bottom w:val="single" w:sz="10" w:color="1F4E79"/>
+        </w:pBdr>
+      </w:pPr>
+      <w:r>
+        <w:rPr>
+          <w:rFonts w:ascii="Calibri" w:hAnsi="Calibri" w:eastAsia="Yu Gothic"/>
+          <w:b/>
+          <w:color w:val="1F4E79"/>
+          <w:sz w:val="58"/>
+        </w:rPr>
+        <w:t>自作ゲームエンジン</w:t>
+        <w:br/>
+        <w:t>プログラム説明資料</w:t>
+      </w:r>
+    </w:p>
+    <w:p>
+      <w:pPr>
+        <w:spacing w:before="320"/>
       </w:pPr>
       <w:r>
         <w:rPr>
           <w:rFonts w:ascii="Calibri" w:hAnsi="Calibri" w:eastAsia="Yu Gothic"/>
           <w:b w:val="0"/>
-          <w:color w:val="5A616E"/>
-          <w:sz w:val="24"/>
+          <w:color w:val="5A6470"/>
+          <w:sz w:val="28"/>
         </w:rPr>
-        <w:t>LE3C_15_チハラ_シゴウ / C++ DirectX 3Dシューティング</w:t>
+        <w:t>3D探索アクションを題材にした、DirectX 12ベースのゲーム／ツール統合設計</w:t>
       </w:r>
     </w:p>
     <w:p>
       <w:pPr>
-        <w:spacing w:after="280"/>
-        <w:pBdr>
-          <w:bottom w:val="single" w:sz="6" w:space="1" w:color="D7DBE2"/>
-        </w:pBdr>
+        <w:spacing w:before="5000"/>
       </w:pPr>
+      <w:r>
+        <w:rPr>
+          <w:rFonts w:ascii="Calibri" w:hAnsi="Calibri" w:eastAsia="Yu Gothic"/>
+          <w:b w:val="0"/>
+          <w:color w:val="5A6470"/>
+          <w:sz w:val="22"/>
+        </w:rPr>
+        <w:t>日本工学院専門学校　LE3C 15</w:t>
+        <w:br/>
+        <w:t>チハラ シゴウ</w:t>
+        <w:br/>
+        <w:t>2026年8月　月次提出</w:t>
+      </w:r>
     </w:p>
-    <w:tbl>
-      <w:tblPr>
-        <w:tblStyle w:val="TableGrid"/>
-        <w:tblW w:type="auto" w:w="0"/>
-        <w:tblLook w:firstColumn="1" w:firstRow="1" w:lastColumn="0" w:lastRow="0" w:noHBand="0" w:noVBand="1" w:val="04A0"/>
-      </w:tblPr>
-      <w:tblGrid>
-        <w:gridCol w:w="4680"/>
-        <w:gridCol w:w="4680"/>
-      </w:tblGrid>
-      <w:tr>
-        <w:tc>
-          <w:tcPr>
-            <w:tcW w:type="dxa" w:w="2232"/>
-            <w:vAlign w:val="center"/>
-            <w:shd w:fill="E8EEF5"/>
-          </w:tcPr>
-          <w:p>
-            <w:pPr>
-              <w:spacing w:after="0"/>
-            </w:pPr>
-            <w:r/>
-            <w:r>
-              <w:rPr>
-                <w:rFonts w:ascii="Calibri" w:hAnsi="Calibri" w:eastAsia="Yu Gothic"/>
-                <w:b/>
-                <w:color w:val="141F2B"/>
-                <w:sz w:val="22"/>
-              </w:rPr>
-              <w:t>対象作品</w:t>
-            </w:r>
-          </w:p>
-        </w:tc>
-        <w:tc>
-          <w:tcPr>
-            <w:tcW w:type="dxa" w:w="7128"/>
-            <w:vAlign w:val="center"/>
-          </w:tcPr>
-          <w:p>
-            <w:pPr>
-              <w:spacing w:after="0"/>
-            </w:pPr>
-            <w:r/>
-            <w:r>
-              <w:rPr>
-                <w:rFonts w:ascii="Calibri" w:hAnsi="Calibri" w:eastAsia="Yu Gothic"/>
-                <w:b w:val="0"/>
-                <w:color w:val="141F2B"/>
-                <w:sz w:val="22"/>
-              </w:rPr>
-              <w:t>トラブル・シューティング</w:t>
-            </w:r>
-          </w:p>
-        </w:tc>
-      </w:tr>
-      <w:tr>
-        <w:tc>
-          <w:tcPr>
-            <w:tcW w:type="dxa" w:w="2232"/>
-            <w:vAlign w:val="center"/>
-            <w:shd w:fill="E8EEF5"/>
-          </w:tcPr>
-          <w:p>
-            <w:pPr>
-              <w:spacing w:after="0"/>
-            </w:pPr>
-            <w:r/>
-            <w:r>
-              <w:rPr>
-                <w:rFonts w:ascii="Calibri" w:hAnsi="Calibri" w:eastAsia="Yu Gothic"/>
-                <w:b/>
-                <w:color w:val="141F2B"/>
-                <w:sz w:val="22"/>
-              </w:rPr>
-              <w:t>プロジェクト</w:t>
-            </w:r>
-          </w:p>
-        </w:tc>
-        <w:tc>
-          <w:tcPr>
-            <w:tcW w:type="dxa" w:w="7128"/>
-            <w:vAlign w:val="center"/>
-          </w:tcPr>
-          <w:p>
-            <w:pPr>
-              <w:spacing w:after="0"/>
-            </w:pPr>
-            <w:r/>
-            <w:r>
-              <w:rPr>
-                <w:rFonts w:ascii="Calibri" w:hAnsi="Calibri" w:eastAsia="Yu Gothic"/>
-                <w:b w:val="0"/>
-                <w:color w:val="141F2B"/>
-                <w:sz w:val="22"/>
-              </w:rPr>
-              <w:t>01_作品_トラブル・シューティング\DirectXGame</w:t>
-            </w:r>
-          </w:p>
-        </w:tc>
-      </w:tr>
-      <w:tr>
-        <w:tc>
-          <w:tcPr>
-            <w:tcW w:type="dxa" w:w="2232"/>
-            <w:vAlign w:val="center"/>
-            <w:shd w:fill="E8EEF5"/>
-          </w:tcPr>
-          <w:p>
-            <w:pPr>
-              <w:spacing w:after="0"/>
-            </w:pPr>
-            <w:r/>
-            <w:r>
-              <w:rPr>
-                <w:rFonts w:ascii="Calibri" w:hAnsi="Calibri" w:eastAsia="Yu Gothic"/>
-                <w:b/>
-                <w:color w:val="141F2B"/>
-                <w:sz w:val="22"/>
-              </w:rPr>
-              <w:t>Release</w:t>
-            </w:r>
-          </w:p>
-        </w:tc>
-        <w:tc>
-          <w:tcPr>
-            <w:tcW w:type="dxa" w:w="7128"/>
-            <w:vAlign w:val="center"/>
-          </w:tcPr>
-          <w:p>
-            <w:pPr>
-              <w:spacing w:after="0"/>
-            </w:pPr>
-            <w:r/>
-            <w:r>
-              <w:rPr>
-                <w:rFonts w:ascii="Calibri" w:hAnsi="Calibri" w:eastAsia="Yu Gothic"/>
-                <w:b w:val="0"/>
-                <w:color w:val="141F2B"/>
-                <w:sz w:val="22"/>
-              </w:rPr>
-              <w:t>01_作品_トラブル・シューティング\リリースファイル</w:t>
-            </w:r>
-          </w:p>
-        </w:tc>
-      </w:tr>
-      <w:tr>
-        <w:tc>
-          <w:tcPr>
-            <w:tcW w:type="dxa" w:w="2232"/>
-            <w:vAlign w:val="center"/>
-            <w:shd w:fill="E8EEF5"/>
-          </w:tcPr>
-          <w:p>
-            <w:pPr>
-              <w:spacing w:after="0"/>
-            </w:pPr>
-            <w:r/>
-            <w:r>
-              <w:rPr>
-                <w:rFonts w:ascii="Calibri" w:hAnsi="Calibri" w:eastAsia="Yu Gothic"/>
-                <w:b/>
-                <w:color w:val="141F2B"/>
-                <w:sz w:val="22"/>
-              </w:rPr>
-              <w:t>動画</w:t>
-            </w:r>
-          </w:p>
-        </w:tc>
-        <w:tc>
-          <w:tcPr>
-            <w:tcW w:type="dxa" w:w="7128"/>
-            <w:vAlign w:val="center"/>
-          </w:tcPr>
-          <w:p>
-            <w:pPr>
-              <w:spacing w:after="0"/>
-            </w:pPr>
-            <w:r/>
-            <w:r>
-              <w:rPr>
-                <w:rFonts w:ascii="Calibri" w:hAnsi="Calibri" w:eastAsia="Yu Gothic"/>
-                <w:b w:val="0"/>
-                <w:color w:val="141F2B"/>
-                <w:sz w:val="22"/>
-              </w:rPr>
-              <w:t>04_作品紹介動画\トラブルシューティング_デモ動画.mp4</w:t>
-            </w:r>
-          </w:p>
-        </w:tc>
-      </w:tr>
-      <w:tr>
-        <w:tc>
-          <w:tcPr>
-            <w:tcW w:type="dxa" w:w="2232"/>
-            <w:vAlign w:val="center"/>
-            <w:shd w:fill="E8EEF5"/>
-          </w:tcPr>
-          <w:p>
-            <w:pPr>
-              <w:spacing w:after="0"/>
-            </w:pPr>
-            <w:r/>
-            <w:r>
-              <w:rPr>
-                <w:rFonts w:ascii="Calibri" w:hAnsi="Calibri" w:eastAsia="Yu Gothic"/>
-                <w:b/>
-                <w:color w:val="141F2B"/>
-                <w:sz w:val="22"/>
-              </w:rPr>
-              <w:t>主な技術</w:t>
-            </w:r>
-          </w:p>
-        </w:tc>
-        <w:tc>
-          <w:tcPr>
-            <w:tcW w:type="dxa" w:w="7128"/>
-            <w:vAlign w:val="center"/>
-          </w:tcPr>
-          <w:p>
-            <w:pPr>
-              <w:spacing w:after="0"/>
-            </w:pPr>
-            <w:r/>
-            <w:r>
-              <w:rPr>
-                <w:rFonts w:ascii="Calibri" w:hAnsi="Calibri" w:eastAsia="Yu Gothic"/>
-                <w:b w:val="0"/>
-                <w:color w:val="141F2B"/>
-                <w:sz w:val="22"/>
-              </w:rPr>
-              <w:t>C++20、DirectX、KamataEngine、OBJモデル描画、シーン管理、当たり判定、サウンド再生</w:t>
-            </w:r>
-          </w:p>
-        </w:tc>
-      </w:tr>
-    </w:tbl>
     <w:p>
-      <w:pPr>
-        <w:spacing w:after="40"/>
-      </w:pPr>
+      <w:r>
+        <w:br w:type="page"/>
+      </w:r>
     </w:p>
     <w:p>
       <w:pPr>
-        <w:pStyle w:val="Heading1"/>
-        <w:spacing w:before="280" w:after="120"/>
+        <w:pBdr>
+          <w:bottom w:val="single" w:sz="10" w:color="1F4E79"/>
+        </w:pBdr>
       </w:pPr>
       <w:r>
         <w:rPr>
           <w:rFonts w:ascii="Calibri" w:hAnsi="Calibri" w:eastAsia="Yu Gothic"/>
           <w:b/>
-          <w:color w:val="2E74B5"/>
-          <w:sz w:val="32"/>
+          <w:color w:val="1F4E79"/>
+          <w:sz w:val="44"/>
         </w:rPr>
-        <w:t>プログラム構成</w:t>
+        <w:t>1. 全体設計</w:t>
       </w:r>
     </w:p>
-    <w:tbl>
-      <w:tblPr>
-        <w:tblStyle w:val="TableGrid"/>
-        <w:tblW w:type="auto" w:w="0"/>
-        <w:tblLook w:firstColumn="1" w:firstRow="1" w:lastColumn="0" w:lastRow="0" w:noHBand="0" w:noVBand="1" w:val="04A0"/>
-      </w:tblPr>
-      <w:tblGrid>
-        <w:gridCol w:w="4680"/>
-        <w:gridCol w:w="4680"/>
-      </w:tblGrid>
-      <w:tr>
-        <w:tc>
-          <w:tcPr>
-            <w:tcW w:type="dxa" w:w="2520"/>
-            <w:vAlign w:val="center"/>
-            <w:shd w:fill="F2F4F7"/>
-          </w:tcPr>
-          <w:p>
-            <w:pPr>
-              <w:spacing w:after="0"/>
-              <w:jc w:val="center"/>
-            </w:pPr>
-            <w:r/>
-            <w:r>
-              <w:rPr>
-                <w:rFonts w:ascii="Calibri" w:hAnsi="Calibri" w:eastAsia="Yu Gothic"/>
-                <w:b/>
-                <w:color w:val="141F2B"/>
-                <w:sz w:val="22"/>
-              </w:rPr>
-              <w:t>クラス/ファイル</w:t>
-            </w:r>
-          </w:p>
-        </w:tc>
-        <w:tc>
-          <w:tcPr>
-            <w:tcW w:type="dxa" w:w="6840"/>
-            <w:vAlign w:val="center"/>
-            <w:shd w:fill="F2F4F7"/>
-          </w:tcPr>
-          <w:p>
-            <w:pPr>
-              <w:spacing w:after="0"/>
-              <w:jc w:val="center"/>
-            </w:pPr>
-            <w:r/>
-            <w:r>
-              <w:rPr>
-                <w:rFonts w:ascii="Calibri" w:hAnsi="Calibri" w:eastAsia="Yu Gothic"/>
-                <w:b/>
-                <w:color w:val="141F2B"/>
-                <w:sz w:val="22"/>
-              </w:rPr>
-              <w:t>役割</w:t>
-            </w:r>
-          </w:p>
-        </w:tc>
-      </w:tr>
-      <w:tr>
-        <w:tc>
-          <w:tcPr>
-            <w:tcW w:type="dxa" w:w="4680"/>
-            <w:vAlign w:val="center"/>
-          </w:tcPr>
-          <w:p>
-            <w:pPr>
-              <w:spacing w:after="0"/>
-            </w:pPr>
-            <w:r/>
-            <w:r>
-              <w:rPr>
-                <w:rFonts w:ascii="Calibri" w:hAnsi="Calibri" w:eastAsia="Yu Gothic"/>
-                <w:b w:val="0"/>
-                <w:color w:val="141F2B"/>
-                <w:sz w:val="22"/>
-              </w:rPr>
-              <w:t>SceneManager</w:t>
-            </w:r>
-          </w:p>
-        </w:tc>
-        <w:tc>
-          <w:tcPr>
-            <w:tcW w:type="dxa" w:w="4680"/>
-            <w:vAlign w:val="center"/>
-          </w:tcPr>
-          <w:p>
-            <w:pPr>
-              <w:spacing w:after="0"/>
-            </w:pPr>
-            <w:r/>
-            <w:r>
-              <w:rPr>
-                <w:rFonts w:ascii="Calibri" w:hAnsi="Calibri" w:eastAsia="Yu Gothic"/>
-                <w:b w:val="0"/>
-                <w:color w:val="141F2B"/>
-                <w:sz w:val="22"/>
-              </w:rPr>
-              <w:t>タイトル、ゲーム、クリア、ゲームオーバーのシーン遷移を管理</w:t>
-            </w:r>
-          </w:p>
-        </w:tc>
-      </w:tr>
-      <w:tr>
-        <w:tc>
-          <w:tcPr>
-            <w:tcW w:type="dxa" w:w="4680"/>
-            <w:vAlign w:val="center"/>
-          </w:tcPr>
-          <w:p>
-            <w:pPr>
-              <w:spacing w:after="0"/>
-            </w:pPr>
-            <w:r/>
-            <w:r>
-              <w:rPr>
-                <w:rFonts w:ascii="Calibri" w:hAnsi="Calibri" w:eastAsia="Yu Gothic"/>
-                <w:b w:val="0"/>
-                <w:color w:val="141F2B"/>
-                <w:sz w:val="22"/>
-              </w:rPr>
-              <w:t>GameScene</w:t>
-            </w:r>
-          </w:p>
-        </w:tc>
-        <w:tc>
-          <w:tcPr>
-            <w:tcW w:type="dxa" w:w="4680"/>
-            <w:vAlign w:val="center"/>
-          </w:tcPr>
-          <w:p>
-            <w:pPr>
-              <w:spacing w:after="0"/>
-            </w:pPr>
-            <w:r/>
-            <w:r>
-              <w:rPr>
-                <w:rFonts w:ascii="Calibri" w:hAnsi="Calibri" w:eastAsia="Yu Gothic"/>
-                <w:b w:val="0"/>
-                <w:color w:val="141F2B"/>
-                <w:sz w:val="22"/>
-              </w:rPr>
-              <w:t>ゲーム本編の初期化、更新、描画、当たり判定、勝敗判定を統括</w:t>
-            </w:r>
-          </w:p>
-        </w:tc>
-      </w:tr>
-      <w:tr>
-        <w:tc>
-          <w:tcPr>
-            <w:tcW w:type="dxa" w:w="4680"/>
-            <w:vAlign w:val="center"/>
-          </w:tcPr>
-          <w:p>
-            <w:pPr>
-              <w:spacing w:after="0"/>
-            </w:pPr>
-            <w:r/>
-            <w:r>
-              <w:rPr>
-                <w:rFonts w:ascii="Calibri" w:hAnsi="Calibri" w:eastAsia="Yu Gothic"/>
-                <w:b w:val="0"/>
-                <w:color w:val="141F2B"/>
-                <w:sz w:val="22"/>
-              </w:rPr>
-              <w:t>Player</w:t>
-            </w:r>
-          </w:p>
-        </w:tc>
-        <w:tc>
-          <w:tcPr>
-            <w:tcW w:type="dxa" w:w="4680"/>
-            <w:vAlign w:val="center"/>
-          </w:tcPr>
-          <w:p>
-            <w:pPr>
-              <w:spacing w:after="0"/>
-            </w:pPr>
-            <w:r/>
-            <w:r>
-              <w:rPr>
-                <w:rFonts w:ascii="Calibri" w:hAnsi="Calibri" w:eastAsia="Yu Gothic"/>
-                <w:b w:val="0"/>
-                <w:color w:val="141F2B"/>
-                <w:sz w:val="22"/>
-              </w:rPr>
-              <w:t>移動、射撃、HP、被弾時の無敵時間、プレイヤー弾の管理</w:t>
-            </w:r>
-          </w:p>
-        </w:tc>
-      </w:tr>
-      <w:tr>
-        <w:tc>
-          <w:tcPr>
-            <w:tcW w:type="dxa" w:w="4680"/>
-            <w:vAlign w:val="center"/>
-          </w:tcPr>
-          <w:p>
-            <w:pPr>
-              <w:spacing w:after="0"/>
-            </w:pPr>
-            <w:r/>
-            <w:r>
-              <w:rPr>
-                <w:rFonts w:ascii="Calibri" w:hAnsi="Calibri" w:eastAsia="Yu Gothic"/>
-                <w:b w:val="0"/>
-                <w:color w:val="141F2B"/>
-                <w:sz w:val="22"/>
-              </w:rPr>
-              <w:t>Enemy</w:t>
-            </w:r>
-          </w:p>
-        </w:tc>
-        <w:tc>
-          <w:tcPr>
-            <w:tcW w:type="dxa" w:w="4680"/>
-            <w:vAlign w:val="center"/>
-          </w:tcPr>
-          <w:p>
-            <w:pPr>
-              <w:spacing w:after="0"/>
-            </w:pPr>
-            <w:r/>
-            <w:r>
-              <w:rPr>
-                <w:rFonts w:ascii="Calibri" w:hAnsi="Calibri" w:eastAsia="Yu Gothic"/>
-                <w:b w:val="0"/>
-                <w:color w:val="141F2B"/>
-                <w:sz w:val="22"/>
-              </w:rPr>
-              <w:t>ボスの移動、HP、被弾処理、攻撃パターンの基礎処理</w:t>
-            </w:r>
-          </w:p>
-        </w:tc>
-      </w:tr>
-      <w:tr>
-        <w:tc>
-          <w:tcPr>
-            <w:tcW w:type="dxa" w:w="4680"/>
-            <w:vAlign w:val="center"/>
-          </w:tcPr>
-          <w:p>
-            <w:pPr>
-              <w:spacing w:after="0"/>
-            </w:pPr>
-            <w:r/>
-            <w:r>
-              <w:rPr>
-                <w:rFonts w:ascii="Calibri" w:hAnsi="Calibri" w:eastAsia="Yu Gothic"/>
-                <w:b w:val="0"/>
-                <w:color w:val="141F2B"/>
-                <w:sz w:val="22"/>
-              </w:rPr>
-              <w:t>Funnel / FunnelBullet</w:t>
-            </w:r>
-          </w:p>
-        </w:tc>
-        <w:tc>
-          <w:tcPr>
-            <w:tcW w:type="dxa" w:w="4680"/>
-            <w:vAlign w:val="center"/>
-          </w:tcPr>
-          <w:p>
-            <w:pPr>
-              <w:spacing w:after="0"/>
-            </w:pPr>
-            <w:r/>
-            <w:r>
-              <w:rPr>
-                <w:rFonts w:ascii="Calibri" w:hAnsi="Calibri" w:eastAsia="Yu Gothic"/>
-                <w:b w:val="0"/>
-                <w:color w:val="141F2B"/>
-                <w:sz w:val="22"/>
-              </w:rPr>
-              <w:t>ボス周囲を回る支援機と、プレイヤーを狙う弾を管理</w:t>
-            </w:r>
-          </w:p>
-        </w:tc>
-      </w:tr>
-      <w:tr>
-        <w:tc>
-          <w:tcPr>
-            <w:tcW w:type="dxa" w:w="4680"/>
-            <w:vAlign w:val="center"/>
-          </w:tcPr>
-          <w:p>
-            <w:pPr>
-              <w:spacing w:after="0"/>
-            </w:pPr>
-            <w:r/>
-            <w:r>
-              <w:rPr>
-                <w:rFonts w:ascii="Calibri" w:hAnsi="Calibri" w:eastAsia="Yu Gothic"/>
-                <w:b w:val="0"/>
-                <w:color w:val="141F2B"/>
-                <w:sz w:val="22"/>
-              </w:rPr>
-              <w:t>HpHud</w:t>
-            </w:r>
-          </w:p>
-        </w:tc>
-        <w:tc>
-          <w:tcPr>
-            <w:tcW w:type="dxa" w:w="4680"/>
-            <w:vAlign w:val="center"/>
-          </w:tcPr>
-          <w:p>
-            <w:pPr>
-              <w:spacing w:after="0"/>
-            </w:pPr>
-            <w:r/>
-            <w:r>
-              <w:rPr>
-                <w:rFonts w:ascii="Calibri" w:hAnsi="Calibri" w:eastAsia="Yu Gothic"/>
-                <w:b w:val="0"/>
-                <w:color w:val="141F2B"/>
-                <w:sz w:val="22"/>
-              </w:rPr>
-              <w:t>プレイヤーHPとボスHPを画面上に表示</w:t>
-            </w:r>
-          </w:p>
-        </w:tc>
-      </w:tr>
-      <w:tr>
-        <w:tc>
-          <w:tcPr>
-            <w:tcW w:type="dxa" w:w="4680"/>
-            <w:vAlign w:val="center"/>
-          </w:tcPr>
-          <w:p>
-            <w:pPr>
-              <w:spacing w:after="0"/>
-            </w:pPr>
-            <w:r/>
-            <w:r>
-              <w:rPr>
-                <w:rFonts w:ascii="Calibri" w:hAnsi="Calibri" w:eastAsia="Yu Gothic"/>
-                <w:b w:val="0"/>
-                <w:color w:val="141F2B"/>
-                <w:sz w:val="22"/>
-              </w:rPr>
-              <w:t>Skydome</w:t>
-            </w:r>
-          </w:p>
-        </w:tc>
-        <w:tc>
-          <w:tcPr>
-            <w:tcW w:type="dxa" w:w="4680"/>
-            <w:vAlign w:val="center"/>
-          </w:tcPr>
-          <w:p>
-            <w:pPr>
-              <w:spacing w:after="0"/>
-            </w:pPr>
-            <w:r/>
-            <w:r>
-              <w:rPr>
-                <w:rFonts w:ascii="Calibri" w:hAnsi="Calibri" w:eastAsia="Yu Gothic"/>
-                <w:b w:val="0"/>
-                <w:color w:val="141F2B"/>
-                <w:sz w:val="22"/>
-              </w:rPr>
-              <w:t>背景空間を描画し、3Dシューティングの舞台を作る</w:t>
-            </w:r>
-          </w:p>
-        </w:tc>
-      </w:tr>
-    </w:tbl>
     <w:p>
-      <w:pPr>
-        <w:spacing w:after="40"/>
-      </w:pPr>
+      <w:r>
+        <w:rPr>
+          <w:rFonts w:ascii="Calibri" w:hAnsi="Calibri" w:eastAsia="Yu Gothic"/>
+          <w:b w:val="0"/>
+          <w:color w:val="5A6470"/>
+          <w:sz w:val="22"/>
+        </w:rPr>
+        <w:t>実行、編集、描画、ゲーム進行を役割別に分離し、MyGameはライフサイクル呼出しに集中させています。</w:t>
+      </w:r>
     </w:p>
     <w:p>
       <w:pPr>
-        <w:pStyle w:val="Heading1"/>
-        <w:spacing w:before="280" w:after="120"/>
+        <w:pStyle w:val="ListBullet"/>
+        <w:spacing w:after="60"/>
+      </w:pPr>
+      <w:r>
+        <w:rPr>
+          <w:rFonts w:ascii="Calibri" w:hAnsi="Calibri" w:eastAsia="Yu Gothic"/>
+          <w:b w:val="0"/>
+          <w:color w:val="1C232B"/>
+          <w:sz w:val="22"/>
+        </w:rPr>
+        <w:t>MyGame：Initialize / Update / Draw / Finalizeの窓口</w:t>
+      </w:r>
+    </w:p>
+    <w:p>
+      <w:pPr>
+        <w:pStyle w:val="ListBullet"/>
+        <w:spacing w:after="60"/>
+      </w:pPr>
+      <w:r>
+        <w:rPr>
+          <w:rFonts w:ascii="Calibri" w:hAnsi="Calibri" w:eastAsia="Yu Gothic"/>
+          <w:b w:val="0"/>
+          <w:color w:val="1C232B"/>
+          <w:sz w:val="22"/>
+        </w:rPr>
+        <w:t>GameRuntime：ゲーム全体の更新と描画の統括</w:t>
+      </w:r>
+    </w:p>
+    <w:p>
+      <w:pPr>
+        <w:pStyle w:val="ListBullet"/>
+        <w:spacing w:after="60"/>
+      </w:pPr>
+      <w:r>
+        <w:rPr>
+          <w:rFonts w:ascii="Calibri" w:hAnsi="Calibri" w:eastAsia="Yu Gothic"/>
+          <w:b w:val="0"/>
+          <w:color w:val="1C232B"/>
+          <w:sz w:val="22"/>
+        </w:rPr>
+        <w:t>各Controller：ステージ、天候、カメラ、UI、シーン遷移を担当</w:t>
+      </w:r>
+    </w:p>
+    <w:p>
+      <w:pPr>
+        <w:pStyle w:val="ListBullet"/>
+        <w:spacing w:after="60"/>
+      </w:pPr>
+      <w:r>
+        <w:rPr>
+          <w:rFonts w:ascii="Calibri" w:hAnsi="Calibri" w:eastAsia="Yu Gothic"/>
+          <w:b w:val="0"/>
+          <w:color w:val="1C232B"/>
+          <w:sz w:val="22"/>
+        </w:rPr>
+        <w:t>Manager群：テクスチャ、モデル、パーティクル、ライト等のリソース管理</w:t>
+      </w:r>
+    </w:p>
+    <w:p>
+      <w:pPr>
+        <w:spacing w:before="160" w:after="60"/>
       </w:pPr>
       <w:r>
         <w:rPr>
           <w:rFonts w:ascii="Calibri" w:hAnsi="Calibri" w:eastAsia="Yu Gothic"/>
           <w:b/>
-          <w:color w:val="2E74B5"/>
-          <w:sz w:val="32"/>
+          <w:color w:val="1991AA"/>
+          <w:sz w:val="28"/>
         </w:rPr>
-        <w:t>更新処理の流れ</w:t>
+        <w:t>狙い</w:t>
+      </w:r>
+    </w:p>
+    <w:p>
+      <w:pPr>
+        <w:spacing w:after="120" w:line="276" w:lineRule="auto"/>
+      </w:pPr>
+      <w:r>
+        <w:rPr>
+          <w:rFonts w:ascii="Calibri" w:hAnsi="Calibri" w:eastAsia="Yu Gothic"/>
+          <w:b w:val="0"/>
+          <w:color w:val="1C232B"/>
+          <w:sz w:val="22"/>
+        </w:rPr>
+        <w:t>巨大化していたMyGame.cppの処理を分割し、機能の所在を明確化。追加機能がゲーム本体へ波及しにくい構成にしました。</w:t>
+      </w:r>
+    </w:p>
+    <w:p>
+      <w:r>
+        <w:br w:type="page"/>
+      </w:r>
+    </w:p>
+    <w:p>
+      <w:pPr>
+        <w:pBdr>
+          <w:bottom w:val="single" w:sz="10" w:color="1F4E79"/>
+        </w:pBdr>
+      </w:pPr>
+      <w:r>
+        <w:rPr>
+          <w:rFonts w:ascii="Calibri" w:hAnsi="Calibri" w:eastAsia="Yu Gothic"/>
+          <w:b/>
+          <w:color w:val="1F4E79"/>
+          <w:sz w:val="44"/>
+        </w:rPr>
+        <w:t>2. プレイヤーとカメラ</w:t>
       </w:r>
     </w:p>
     <w:p>
       <w:pPr>
         <w:pStyle w:val="ListBullet"/>
-        <w:spacing w:after="80"/>
+        <w:spacing w:after="60"/>
       </w:pPr>
       <w:r>
         <w:rPr>
           <w:rFonts w:ascii="Calibri" w:hAnsi="Calibri" w:eastAsia="Yu Gothic"/>
           <w:b w:val="0"/>
-          <w:color w:val="141F2B"/>
+          <w:color w:val="1C232B"/>
           <w:sz w:val="22"/>
         </w:rPr>
-        <w:t>入力を取得し、プレイヤーの移動と射撃を更新する</w:t>
+        <w:t>移動・ジャンプ・落下時のスポーン／中継地点復帰</w:t>
       </w:r>
     </w:p>
     <w:p>
       <w:pPr>
         <w:pStyle w:val="ListBullet"/>
-        <w:spacing w:after="80"/>
+        <w:spacing w:after="60"/>
       </w:pPr>
       <w:r>
         <w:rPr>
           <w:rFonts w:ascii="Calibri" w:hAnsi="Calibri" w:eastAsia="Yu Gothic"/>
           <w:b w:val="0"/>
-          <w:color w:val="141F2B"/>
+          <w:color w:val="1C232B"/>
           <w:sz w:val="22"/>
         </w:rPr>
-        <w:t>ボス本体とファンネルの位置を更新し、攻撃パターンに応じて弾を生成する</w:t>
+        <w:t>追従カメラと全体カメラの切替</w:t>
       </w:r>
     </w:p>
     <w:p>
       <w:pPr>
         <w:pStyle w:val="ListBullet"/>
-        <w:spacing w:after="80"/>
+        <w:spacing w:after="60"/>
       </w:pPr>
       <w:r>
         <w:rPr>
           <w:rFonts w:ascii="Calibri" w:hAnsi="Calibri" w:eastAsia="Yu Gothic"/>
           <w:b w:val="0"/>
-          <w:color w:val="141F2B"/>
+          <w:color w:val="1C232B"/>
           <w:sz w:val="22"/>
         </w:rPr>
-        <w:t>プレイヤー弾、敵弾を更新し、寿命切れの弾を削除する</w:t>
+        <w:t>マウスとXboxコントローラーによる回転・ズーム</w:t>
       </w:r>
     </w:p>
     <w:p>
       <w:pPr>
         <w:pStyle w:val="ListBullet"/>
-        <w:spacing w:after="80"/>
+        <w:spacing w:after="60"/>
       </w:pPr>
       <w:r>
         <w:rPr>
           <w:rFonts w:ascii="Calibri" w:hAnsi="Calibri" w:eastAsia="Yu Gothic"/>
           <w:b w:val="0"/>
-          <w:color w:val="141F2B"/>
+          <w:color w:val="1C232B"/>
           <w:sz w:val="22"/>
         </w:rPr>
-        <w:t>プレイヤーと敵弾、ボスとプレイヤー弾の当たり判定を行う</w:t>
+        <w:t>ゴール座標への到達判定とシーン進行</w:t>
+      </w:r>
+    </w:p>
+    <w:p>
+      <w:pPr>
+        <w:spacing w:after="120" w:line="276" w:lineRule="auto"/>
+      </w:pPr>
+      <w:r>
+        <w:rPr>
+          <w:rFonts w:ascii="Calibri" w:hAnsi="Calibri" w:eastAsia="Yu Gothic"/>
+          <w:b w:val="0"/>
+          <w:color w:val="1C232B"/>
+          <w:sz w:val="22"/>
+        </w:rPr>
+        <w:t>入力はキーボードとXInputを共通のプレイヤー更新へ渡し、操作デバイスによってゲームロジックが分岐しすぎないようにしています。</w:t>
+      </w:r>
+    </w:p>
+    <w:p>
+      <w:pPr>
+        <w:jc w:val="center"/>
+      </w:pPr>
+      <w:r>
+        <w:drawing>
+          <wp:inline xmlns:a="http://schemas.openxmlformats.org/drawingml/2006/main" xmlns:pic="http://schemas.openxmlformats.org/drawingml/2006/picture">
+            <wp:extent cx="5943600" cy="3069312"/>
+            <wp:docPr id="1" name="Picture 1"/>
+            <wp:cNvGraphicFramePr>
+              <a:graphicFrameLocks noChangeAspect="1"/>
+            </wp:cNvGraphicFramePr>
+            <a:graphic>
+              <a:graphicData uri="http://schemas.openxmlformats.org/drawingml/2006/picture">
+                <pic:pic>
+                  <pic:nvPicPr>
+                    <pic:cNvPr id="0" name="frame_05.png"/>
+                    <pic:cNvPicPr/>
+                  </pic:nvPicPr>
+                  <pic:blipFill>
+                    <a:blip r:embed="rId9"/>
+                    <a:stretch>
+                      <a:fillRect/>
+                    </a:stretch>
+                  </pic:blipFill>
+                  <pic:spPr>
+                    <a:xfrm>
+                      <a:off x="0" y="0"/>
+                      <a:ext cx="5943600" cy="3069312"/>
+                    </a:xfrm>
+                    <a:prstGeom prst="rect"/>
+                  </pic:spPr>
+                </pic:pic>
+              </a:graphicData>
+            </a:graphic>
+          </wp:inline>
+        </w:drawing>
+      </w:r>
+    </w:p>
+    <w:p>
+      <w:pPr>
+        <w:jc w:val="center"/>
+      </w:pPr>
+      <w:r>
+        <w:rPr>
+          <w:rFonts w:ascii="Calibri" w:hAnsi="Calibri" w:eastAsia="Yu Gothic"/>
+          <w:b w:val="0"/>
+          <w:color w:val="5A6470"/>
+          <w:sz w:val="18"/>
+        </w:rPr>
+        <w:t>ゲームプレイ画面。ステージ、ゴール、天候演出を同時に確認できる。</w:t>
+      </w:r>
+    </w:p>
+    <w:p>
+      <w:r>
+        <w:br w:type="page"/>
+      </w:r>
+    </w:p>
+    <w:p>
+      <w:pPr>
+        <w:pBdr>
+          <w:bottom w:val="single" w:sz="10" w:color="1F4E79"/>
+        </w:pBdr>
+      </w:pPr>
+      <w:r>
+        <w:rPr>
+          <w:rFonts w:ascii="Calibri" w:hAnsi="Calibri" w:eastAsia="Yu Gothic"/>
+          <w:b/>
+          <w:color w:val="1F4E79"/>
+          <w:sz w:val="44"/>
+        </w:rPr>
+        <w:t>3. ステージ制作と外部連携</w:t>
       </w:r>
     </w:p>
     <w:p>
       <w:pPr>
         <w:pStyle w:val="ListBullet"/>
-        <w:spacing w:after="80"/>
+        <w:spacing w:after="60"/>
       </w:pPr>
       <w:r>
         <w:rPr>
           <w:rFonts w:ascii="Calibri" w:hAnsi="Calibri" w:eastAsia="Yu Gothic"/>
           <w:b w:val="0"/>
-          <w:color w:val="141F2B"/>
+          <w:color w:val="1C232B"/>
           <w:sz w:val="22"/>
         </w:rPr>
-        <w:t>HPが0になった対象を確認し、クリアまたはゲームオーバーへシーン遷移する</w:t>
+        <w:t>ImGuiステージエディタで配置・削除・回転・保存</w:t>
       </w:r>
     </w:p>
     <w:p>
       <w:pPr>
-        <w:pStyle w:val="Heading1"/>
-        <w:spacing w:before="280" w:after="120"/>
+        <w:pStyle w:val="ListBullet"/>
+        <w:spacing w:after="60"/>
+      </w:pPr>
+      <w:r>
+        <w:rPr>
+          <w:rFonts w:ascii="Calibri" w:hAnsi="Calibri" w:eastAsia="Yu Gothic"/>
+          <w:b w:val="0"/>
+          <w:color w:val="1C232B"/>
+          <w:sz w:val="22"/>
+        </w:rPr>
+        <w:t>保存済みステージと外部レベルの一覧表示</w:t>
+      </w:r>
+    </w:p>
+    <w:p>
+      <w:pPr>
+        <w:pStyle w:val="ListBullet"/>
+        <w:spacing w:after="60"/>
+      </w:pPr>
+      <w:r>
+        <w:rPr>
+          <w:rFonts w:ascii="Calibri" w:hAnsi="Calibri" w:eastAsia="Yu Gothic"/>
+          <w:b w:val="0"/>
+          <w:color w:val="1C232B"/>
+          <w:sz w:val="22"/>
+        </w:rPr>
+        <w:t>Blenderから出力したJSONをゲームとエディタの両方で読込</w:t>
+      </w:r>
+    </w:p>
+    <w:p>
+      <w:pPr>
+        <w:pStyle w:val="ListBullet"/>
+        <w:spacing w:after="60"/>
+      </w:pPr>
+      <w:r>
+        <w:rPr>
+          <w:rFonts w:ascii="Calibri" w:hAnsi="Calibri" w:eastAsia="Yu Gothic"/>
+          <w:b w:val="0"/>
+          <w:color w:val="1C232B"/>
+          <w:sz w:val="22"/>
+        </w:rPr>
+        <w:t>起動中のファイル変更を検知し、確認後に再読込</w:t>
+      </w:r>
+    </w:p>
+    <w:p>
+      <w:pPr>
+        <w:spacing w:after="120" w:line="276" w:lineRule="auto"/>
+      </w:pPr>
+      <w:r>
+        <w:rPr>
+          <w:rFonts w:ascii="Calibri" w:hAnsi="Calibri" w:eastAsia="Yu Gothic"/>
+          <w:b w:val="0"/>
+          <w:color w:val="1C232B"/>
+          <w:sz w:val="22"/>
+        </w:rPr>
+        <w:t>外部ツールで編集した結果を短い反復で確認できるため、ステージ制作の試行回数を増やせます。</w:t>
+      </w:r>
+    </w:p>
+    <w:p>
+      <w:r>
+        <w:br w:type="page"/>
+      </w:r>
+    </w:p>
+    <w:p>
+      <w:pPr>
+        <w:pBdr>
+          <w:bottom w:val="single" w:sz="10" w:color="1F4E79"/>
+        </w:pBdr>
       </w:pPr>
       <w:r>
         <w:rPr>
           <w:rFonts w:ascii="Calibri" w:hAnsi="Calibri" w:eastAsia="Yu Gothic"/>
           <w:b/>
-          <w:color w:val="2E74B5"/>
-          <w:sz w:val="32"/>
+          <w:color w:val="1F4E79"/>
+          <w:sz w:val="44"/>
         </w:rPr>
-        <w:t>当たり判定とダメージ処理</w:t>
+        <w:t>4. 天候・照明・エフェクト</w:t>
       </w:r>
     </w:p>
     <w:p>
       <w:pPr>
-        <w:spacing w:after="120" w:line="264" w:lineRule="auto"/>
+        <w:pStyle w:val="ListBullet"/>
+        <w:spacing w:after="60"/>
       </w:pPr>
       <w:r>
         <w:rPr>
           <w:rFonts w:ascii="Calibri" w:hAnsi="Calibri" w:eastAsia="Yu Gothic"/>
           <w:b w:val="0"/>
-          <w:color w:val="141F2B"/>
+          <w:color w:val="1C232B"/>
           <w:sz w:val="22"/>
         </w:rPr>
-        <w:t>敵弾とプレイヤーは距離ベースで判定し、プレイヤー弾とボスはAABBで判定しています。被弾時はHPを減らし、プレイヤーには短時間の無敵時間を持たせて連続ヒットを防いでいます。ボスは被弾フラッシュでダメージを視覚的に伝える構成です。</w:t>
+        <w:t>天候プリセットで空色、明るさ、ライト、パーティクルを一括変更</w:t>
       </w:r>
     </w:p>
     <w:p>
       <w:pPr>
-        <w:pStyle w:val="Heading1"/>
-        <w:spacing w:before="280" w:after="120"/>
+        <w:pStyle w:val="ListBullet"/>
+        <w:spacing w:after="60"/>
+      </w:pPr>
+      <w:r>
+        <w:rPr>
+          <w:rFonts w:ascii="Calibri" w:hAnsi="Calibri" w:eastAsia="Yu Gothic"/>
+          <w:b w:val="0"/>
+          <w:color w:val="1C232B"/>
+          <w:sz w:val="22"/>
+        </w:rPr>
+        <w:t>雨・雪の衝突地点で専用パーティクルを生成</w:t>
+      </w:r>
+    </w:p>
+    <w:p>
+      <w:pPr>
+        <w:pStyle w:val="ListBullet"/>
+        <w:spacing w:after="60"/>
+      </w:pPr>
+      <w:r>
+        <w:rPr>
+          <w:rFonts w:ascii="Calibri" w:hAnsi="Calibri" w:eastAsia="Yu Gothic"/>
+          <w:b w:val="0"/>
+          <w:color w:val="1C232B"/>
+          <w:sz w:val="22"/>
+        </w:rPr>
+        <w:t>Tempest Stormの雲・風雨・雷をゲームシーンへ統合</w:t>
+      </w:r>
+    </w:p>
+    <w:p>
+      <w:pPr>
+        <w:pStyle w:val="ListBullet"/>
+        <w:spacing w:after="60"/>
+      </w:pPr>
+      <w:r>
+        <w:rPr>
+          <w:rFonts w:ascii="Calibri" w:hAnsi="Calibri" w:eastAsia="Yu Gothic"/>
+          <w:b w:val="0"/>
+          <w:color w:val="1C232B"/>
+          <w:sz w:val="22"/>
+        </w:rPr>
+        <w:t>複数光源によりプレイヤーライトと雷光を同時使用</w:t>
+      </w:r>
+    </w:p>
+    <w:p>
+      <w:pPr>
+        <w:pStyle w:val="ListBullet"/>
+        <w:spacing w:after="60"/>
+      </w:pPr>
+      <w:r>
+        <w:rPr>
+          <w:rFonts w:ascii="Calibri" w:hAnsi="Calibri" w:eastAsia="Yu Gothic"/>
+          <w:b w:val="0"/>
+          <w:color w:val="1C232B"/>
+          <w:sz w:val="22"/>
+        </w:rPr>
+        <w:t>シーン遷移時に天候とポストエフェクトをNormalへ復帰</w:t>
+      </w:r>
+    </w:p>
+    <w:p>
+      <w:pPr>
+        <w:jc w:val="center"/>
+      </w:pPr>
+      <w:r>
+        <w:drawing>
+          <wp:inline xmlns:a="http://schemas.openxmlformats.org/drawingml/2006/main" xmlns:pic="http://schemas.openxmlformats.org/drawingml/2006/picture">
+            <wp:extent cx="5943600" cy="3069312"/>
+            <wp:docPr id="2" name="Picture 2"/>
+            <wp:cNvGraphicFramePr>
+              <a:graphicFrameLocks noChangeAspect="1"/>
+            </wp:cNvGraphicFramePr>
+            <a:graphic>
+              <a:graphicData uri="http://schemas.openxmlformats.org/drawingml/2006/picture">
+                <pic:pic>
+                  <pic:nvPicPr>
+                    <pic:cNvPr id="0" name="frame_03.png"/>
+                    <pic:cNvPicPr/>
+                  </pic:nvPicPr>
+                  <pic:blipFill>
+                    <a:blip r:embed="rId10"/>
+                    <a:stretch>
+                      <a:fillRect/>
+                    </a:stretch>
+                  </pic:blipFill>
+                  <pic:spPr>
+                    <a:xfrm>
+                      <a:off x="0" y="0"/>
+                      <a:ext cx="5943600" cy="3069312"/>
+                    </a:xfrm>
+                    <a:prstGeom prst="rect"/>
+                  </pic:spPr>
+                </pic:pic>
+              </a:graphicData>
+            </a:graphic>
+          </wp:inline>
+        </w:drawing>
+      </w:r>
+    </w:p>
+    <w:p>
+      <w:pPr>
+        <w:jc w:val="center"/>
+      </w:pPr>
+      <w:r>
+        <w:rPr>
+          <w:rFonts w:ascii="Calibri" w:hAnsi="Calibri" w:eastAsia="Yu Gothic"/>
+          <w:b w:val="0"/>
+          <w:color w:val="5A6470"/>
+          <w:sz w:val="18"/>
+        </w:rPr>
+        <w:t>暗天候時のステージ。環境光と雷演出がゲーム空間へ反映される。</w:t>
+      </w:r>
+    </w:p>
+    <w:p>
+      <w:r>
+        <w:br w:type="page"/>
+      </w:r>
+    </w:p>
+    <w:p>
+      <w:pPr>
+        <w:pBdr>
+          <w:bottom w:val="single" w:sz="10" w:color="1F4E79"/>
+        </w:pBdr>
       </w:pPr>
       <w:r>
         <w:rPr>
           <w:rFonts w:ascii="Calibri" w:hAnsi="Calibri" w:eastAsia="Yu Gothic"/>
           <w:b/>
-          <w:color w:val="2E74B5"/>
-          <w:sz w:val="32"/>
+          <w:color w:val="1F4E79"/>
+          <w:sz w:val="44"/>
         </w:rPr>
-        <w:t>ボス/ファンネル攻撃</w:t>
+        <w:t>5. GPUスキニングとアニメーション</w:t>
       </w:r>
     </w:p>
     <w:p>
       <w:pPr>
-        <w:spacing w:after="120" w:line="264" w:lineRule="auto"/>
+        <w:pStyle w:val="ListBullet"/>
+        <w:spacing w:after="60"/>
       </w:pPr>
       <w:r>
         <w:rPr>
           <w:rFonts w:ascii="Calibri" w:hAnsi="Calibri" w:eastAsia="Yu Gothic"/>
           <w:b w:val="0"/>
-          <w:color w:val="141F2B"/>
+          <w:color w:val="1C232B"/>
           <w:sz w:val="22"/>
         </w:rPr>
-        <w:t>ボスの周囲に3基のファンネルを配置し、ボス位置を中心に追従させます。攻撃パターンでは各ファンネルからプレイヤー方向へ弾を連射し、ボス本体だけでなく周辺ユニットも脅威になるようにしました。</w:t>
+        <w:t>Compute Shaderで頂点スキニングを実行</w:t>
       </w:r>
     </w:p>
     <w:p>
       <w:pPr>
-        <w:pStyle w:val="Heading1"/>
-        <w:spacing w:before="280" w:after="120"/>
+        <w:pStyle w:val="ListBullet"/>
+        <w:spacing w:after="60"/>
+      </w:pPr>
+      <w:r>
+        <w:rPr>
+          <w:rFonts w:ascii="Calibri" w:hAnsi="Calibri" w:eastAsia="Yu Gothic"/>
+          <w:b w:val="0"/>
+          <w:color w:val="1C232B"/>
+          <w:sz w:val="22"/>
+        </w:rPr>
+        <w:t>複数メッシュ／複数マテリアルのモデルを扱う</w:t>
+      </w:r>
+    </w:p>
+    <w:p>
+      <w:pPr>
+        <w:pStyle w:val="ListBullet"/>
+        <w:spacing w:after="60"/>
+      </w:pPr>
+      <w:r>
+        <w:rPr>
+          <w:rFonts w:ascii="Calibri" w:hAnsi="Calibri" w:eastAsia="Yu Gothic"/>
+          <w:b w:val="0"/>
+          <w:color w:val="1C232B"/>
+          <w:sz w:val="22"/>
+        </w:rPr>
+        <w:t>アニメーション間を補間し、急なTポーズへの復帰を抑制</w:t>
+      </w:r>
+    </w:p>
+    <w:p>
+      <w:pPr>
+        <w:pStyle w:val="ListBullet"/>
+        <w:spacing w:after="60"/>
+      </w:pPr>
+      <w:r>
+        <w:rPr>
+          <w:rFonts w:ascii="Calibri" w:hAnsi="Calibri" w:eastAsia="Yu Gothic"/>
+          <w:b w:val="0"/>
+          <w:color w:val="1C232B"/>
+          <w:sz w:val="22"/>
+        </w:rPr>
+        <w:t>ボーン・ジョイント・名前・軸をデバッグ表示</w:t>
+      </w:r>
+    </w:p>
+    <w:p>
+      <w:pPr>
+        <w:pStyle w:val="ListBullet"/>
+        <w:spacing w:after="60"/>
+      </w:pPr>
+      <w:r>
+        <w:rPr>
+          <w:rFonts w:ascii="Calibri" w:hAnsi="Calibri" w:eastAsia="Yu Gothic"/>
+          <w:b w:val="0"/>
+          <w:color w:val="1C232B"/>
+          <w:sz w:val="22"/>
+        </w:rPr>
+        <w:t>右手ジョイントへ武器、左手ジョイントへGPUパーティクルを追従</w:t>
+      </w:r>
+    </w:p>
+    <w:p>
+      <w:pPr>
+        <w:spacing w:after="120" w:line="276" w:lineRule="auto"/>
+      </w:pPr>
+      <w:r>
+        <w:rPr>
+          <w:rFonts w:ascii="Calibri" w:hAnsi="Calibri" w:eastAsia="Yu Gothic"/>
+          <w:b w:val="0"/>
+          <w:color w:val="1C232B"/>
+          <w:sz w:val="22"/>
+        </w:rPr>
+        <w:t>CPUで全頂点を毎フレーム変形せず、GPU側に処理を寄せることで、モデル切替や複数描画へ拡張しやすい構成を目指しています。</w:t>
+      </w:r>
+    </w:p>
+    <w:p>
+      <w:r>
+        <w:br w:type="page"/>
+      </w:r>
+    </w:p>
+    <w:p>
+      <w:pPr>
+        <w:pBdr>
+          <w:bottom w:val="single" w:sz="10" w:color="1F4E79"/>
+        </w:pBdr>
       </w:pPr>
       <w:r>
         <w:rPr>
           <w:rFonts w:ascii="Calibri" w:hAnsi="Calibri" w:eastAsia="Yu Gothic"/>
           <w:b/>
-          <w:color w:val="2E74B5"/>
-          <w:sz w:val="32"/>
+          <w:color w:val="1F4E79"/>
+          <w:sz w:val="44"/>
         </w:rPr>
-        <w:t>ビルド・実行</w:t>
+        <w:t>6. 描画と安定性</w:t>
       </w:r>
-    </w:p>
-    <w:tbl>
-      <w:tblPr>
-        <w:tblStyle w:val="TableGrid"/>
-        <w:tblW w:type="auto" w:w="0"/>
-        <w:tblLook w:firstColumn="1" w:firstRow="1" w:lastColumn="0" w:lastRow="0" w:noHBand="0" w:noVBand="1" w:val="04A0"/>
-      </w:tblPr>
-      <w:tblGrid>
-        <w:gridCol w:w="4680"/>
-        <w:gridCol w:w="4680"/>
-      </w:tblGrid>
-      <w:tr>
-        <w:tc>
-          <w:tcPr>
-            <w:tcW w:type="dxa" w:w="2088"/>
-            <w:vAlign w:val="center"/>
-            <w:shd w:fill="F2F4F7"/>
-          </w:tcPr>
-          <w:p>
-            <w:pPr>
-              <w:spacing w:after="0"/>
-              <w:jc w:val="center"/>
-            </w:pPr>
-            <w:r/>
-            <w:r>
-              <w:rPr>
-                <w:rFonts w:ascii="Calibri" w:hAnsi="Calibri" w:eastAsia="Yu Gothic"/>
-                <w:b/>
-                <w:color w:val="141F2B"/>
-                <w:sz w:val="22"/>
-              </w:rPr>
-              <w:t>項目</w:t>
-            </w:r>
-          </w:p>
-        </w:tc>
-        <w:tc>
-          <w:tcPr>
-            <w:tcW w:type="dxa" w:w="7272"/>
-            <w:vAlign w:val="center"/>
-            <w:shd w:fill="F2F4F7"/>
-          </w:tcPr>
-          <w:p>
-            <w:pPr>
-              <w:spacing w:after="0"/>
-              <w:jc w:val="center"/>
-            </w:pPr>
-            <w:r/>
-            <w:r>
-              <w:rPr>
-                <w:rFonts w:ascii="Calibri" w:hAnsi="Calibri" w:eastAsia="Yu Gothic"/>
-                <w:b/>
-                <w:color w:val="141F2B"/>
-                <w:sz w:val="22"/>
-              </w:rPr>
-              <w:t>内容</w:t>
-            </w:r>
-          </w:p>
-        </w:tc>
-      </w:tr>
-      <w:tr>
-        <w:tc>
-          <w:tcPr>
-            <w:tcW w:type="dxa" w:w="4680"/>
-            <w:vAlign w:val="center"/>
-          </w:tcPr>
-          <w:p>
-            <w:pPr>
-              <w:spacing w:after="0"/>
-            </w:pPr>
-            <w:r/>
-            <w:r>
-              <w:rPr>
-                <w:rFonts w:ascii="Calibri" w:hAnsi="Calibri" w:eastAsia="Yu Gothic"/>
-                <w:b w:val="0"/>
-                <w:color w:val="141F2B"/>
-                <w:sz w:val="22"/>
-              </w:rPr>
-              <w:t>必要環境</w:t>
-            </w:r>
-          </w:p>
-        </w:tc>
-        <w:tc>
-          <w:tcPr>
-            <w:tcW w:type="dxa" w:w="4680"/>
-            <w:vAlign w:val="center"/>
-          </w:tcPr>
-          <w:p>
-            <w:pPr>
-              <w:spacing w:after="0"/>
-            </w:pPr>
-            <w:r/>
-            <w:r>
-              <w:rPr>
-                <w:rFonts w:ascii="Calibri" w:hAnsi="Calibri" w:eastAsia="Yu Gothic"/>
-                <w:b w:val="0"/>
-                <w:color w:val="141F2B"/>
-                <w:sz w:val="22"/>
-              </w:rPr>
-              <w:t>Windows 10/11、Visual Studio 2022、DirectX対応環境</w:t>
-            </w:r>
-          </w:p>
-        </w:tc>
-      </w:tr>
-      <w:tr>
-        <w:tc>
-          <w:tcPr>
-            <w:tcW w:type="dxa" w:w="4680"/>
-            <w:vAlign w:val="center"/>
-          </w:tcPr>
-          <w:p>
-            <w:pPr>
-              <w:spacing w:after="0"/>
-            </w:pPr>
-            <w:r/>
-            <w:r>
-              <w:rPr>
-                <w:rFonts w:ascii="Calibri" w:hAnsi="Calibri" w:eastAsia="Yu Gothic"/>
-                <w:b w:val="0"/>
-                <w:color w:val="141F2B"/>
-                <w:sz w:val="22"/>
-              </w:rPr>
-              <w:t>構成</w:t>
-            </w:r>
-          </w:p>
-        </w:tc>
-        <w:tc>
-          <w:tcPr>
-            <w:tcW w:type="dxa" w:w="4680"/>
-            <w:vAlign w:val="center"/>
-          </w:tcPr>
-          <w:p>
-            <w:pPr>
-              <w:spacing w:after="0"/>
-            </w:pPr>
-            <w:r/>
-            <w:r>
-              <w:rPr>
-                <w:rFonts w:ascii="Calibri" w:hAnsi="Calibri" w:eastAsia="Yu Gothic"/>
-                <w:b w:val="0"/>
-                <w:color w:val="141F2B"/>
-                <w:sz w:val="22"/>
-              </w:rPr>
-              <w:t>Release | x64</w:t>
-            </w:r>
-          </w:p>
-        </w:tc>
-      </w:tr>
-      <w:tr>
-        <w:tc>
-          <w:tcPr>
-            <w:tcW w:type="dxa" w:w="4680"/>
-            <w:vAlign w:val="center"/>
-          </w:tcPr>
-          <w:p>
-            <w:pPr>
-              <w:spacing w:after="0"/>
-            </w:pPr>
-            <w:r/>
-            <w:r>
-              <w:rPr>
-                <w:rFonts w:ascii="Calibri" w:hAnsi="Calibri" w:eastAsia="Yu Gothic"/>
-                <w:b w:val="0"/>
-                <w:color w:val="141F2B"/>
-                <w:sz w:val="22"/>
-              </w:rPr>
-              <w:t>起動</w:t>
-            </w:r>
-          </w:p>
-        </w:tc>
-        <w:tc>
-          <w:tcPr>
-            <w:tcW w:type="dxa" w:w="4680"/>
-            <w:vAlign w:val="center"/>
-          </w:tcPr>
-          <w:p>
-            <w:pPr>
-              <w:spacing w:after="0"/>
-            </w:pPr>
-            <w:r/>
-            <w:r>
-              <w:rPr>
-                <w:rFonts w:ascii="Calibri" w:hAnsi="Calibri" w:eastAsia="Yu Gothic"/>
-                <w:b w:val="0"/>
-                <w:color w:val="141F2B"/>
-                <w:sz w:val="22"/>
-              </w:rPr>
-              <w:t>Releaseフォルダ内のDirectXGame.exeを実行</w:t>
-            </w:r>
-          </w:p>
-        </w:tc>
-      </w:tr>
-      <w:tr>
-        <w:tc>
-          <w:tcPr>
-            <w:tcW w:type="dxa" w:w="4680"/>
-            <w:vAlign w:val="center"/>
-          </w:tcPr>
-          <w:p>
-            <w:pPr>
-              <w:spacing w:after="0"/>
-            </w:pPr>
-            <w:r/>
-            <w:r>
-              <w:rPr>
-                <w:rFonts w:ascii="Calibri" w:hAnsi="Calibri" w:eastAsia="Yu Gothic"/>
-                <w:b w:val="0"/>
-                <w:color w:val="141F2B"/>
-                <w:sz w:val="22"/>
-              </w:rPr>
-              <w:t>注意</w:t>
-            </w:r>
-          </w:p>
-        </w:tc>
-        <w:tc>
-          <w:tcPr>
-            <w:tcW w:type="dxa" w:w="4680"/>
-            <w:vAlign w:val="center"/>
-          </w:tcPr>
-          <w:p>
-            <w:pPr>
-              <w:spacing w:after="0"/>
-            </w:pPr>
-            <w:r/>
-            <w:r>
-              <w:rPr>
-                <w:rFonts w:ascii="Calibri" w:hAnsi="Calibri" w:eastAsia="Yu Gothic"/>
-                <w:b w:val="0"/>
-                <w:color w:val="141F2B"/>
-                <w:sz w:val="22"/>
-              </w:rPr>
-              <w:t>Resourcesフォルダをexeと同じ階層に置く。ソースをビルドする場合はDirectXGameと同じ階層のExternalも必要。</w:t>
-            </w:r>
-          </w:p>
-        </w:tc>
-      </w:tr>
-    </w:tbl>
-    <w:p>
-      <w:pPr>
-        <w:spacing w:after="40"/>
-      </w:pPr>
     </w:p>
     <w:p>
       <w:pPr>
-        <w:pStyle w:val="Heading1"/>
-        <w:spacing w:before="280" w:after="120"/>
+        <w:pStyle w:val="ListBullet"/>
+        <w:spacing w:after="60"/>
+      </w:pPr>
+      <w:r>
+        <w:rPr>
+          <w:rFonts w:ascii="Calibri" w:hAnsi="Calibri" w:eastAsia="Yu Gothic"/>
+          <w:b w:val="0"/>
+          <w:color w:val="1C232B"/>
+          <w:sz w:val="22"/>
+        </w:rPr>
+        <w:t>GPUパーティクルとエフェクトエディタ</w:t>
+      </w:r>
+    </w:p>
+    <w:p>
+      <w:pPr>
+        <w:pStyle w:val="ListBullet"/>
+        <w:spacing w:after="60"/>
+      </w:pPr>
+      <w:r>
+        <w:rPr>
+          <w:rFonts w:ascii="Calibri" w:hAnsi="Calibri" w:eastAsia="Yu Gothic"/>
+          <w:b w:val="0"/>
+          <w:color w:val="1C232B"/>
+          <w:sz w:val="22"/>
+        </w:rPr>
+        <w:t>Grayscale、Vignetting、Dissolve等のポストエフェクト</w:t>
+      </w:r>
+    </w:p>
+    <w:p>
+      <w:pPr>
+        <w:pStyle w:val="ListBullet"/>
+        <w:spacing w:after="60"/>
+      </w:pPr>
+      <w:r>
+        <w:rPr>
+          <w:rFonts w:ascii="Calibri" w:hAnsi="Calibri" w:eastAsia="Yu Gothic"/>
+          <w:b w:val="0"/>
+          <w:color w:val="1C232B"/>
+          <w:sz w:val="22"/>
+        </w:rPr>
+        <w:t>複数ライトの同時格納とシーン別リセット</w:t>
+      </w:r>
+    </w:p>
+    <w:p>
+      <w:pPr>
+        <w:pStyle w:val="ListBullet"/>
+        <w:spacing w:after="60"/>
+      </w:pPr>
+      <w:r>
+        <w:rPr>
+          <w:rFonts w:ascii="Calibri" w:hAnsi="Calibri" w:eastAsia="Yu Gothic"/>
+          <w:b w:val="0"/>
+          <w:color w:val="1C232B"/>
+          <w:sz w:val="22"/>
+        </w:rPr>
+        <w:t>D3D12リソースとディスクリプタの使用範囲を整理</w:t>
+      </w:r>
+    </w:p>
+    <w:p>
+      <w:pPr>
+        <w:pStyle w:val="ListBullet"/>
+        <w:spacing w:after="60"/>
+      </w:pPr>
+      <w:r>
+        <w:rPr>
+          <w:rFonts w:ascii="Calibri" w:hAnsi="Calibri" w:eastAsia="Yu Gothic"/>
+          <w:b w:val="0"/>
+          <w:color w:val="1C232B"/>
+          <w:sz w:val="22"/>
+        </w:rPr>
+        <w:t>シーン切替・モデル切替時の状態残留を防止</w:t>
+      </w:r>
+    </w:p>
+    <w:p>
+      <w:pPr>
+        <w:spacing w:before="160" w:after="60"/>
       </w:pPr>
       <w:r>
         <w:rPr>
           <w:rFonts w:ascii="Calibri" w:hAnsi="Calibri" w:eastAsia="Yu Gothic"/>
           <w:b/>
-          <w:color w:val="2E74B5"/>
-          <w:sz w:val="32"/>
+          <w:color w:val="1991AA"/>
+          <w:sz w:val="28"/>
         </w:rPr>
-        <w:t>アピールしたい技術点</w:t>
+        <w:t>今後の改善</w:t>
       </w:r>
     </w:p>
     <w:p>
       <w:pPr>
-        <w:pStyle w:val="ListBullet"/>
-        <w:spacing w:after="80"/>
+        <w:spacing w:after="120" w:line="276" w:lineRule="auto"/>
       </w:pPr>
       <w:r>
         <w:rPr>
           <w:rFonts w:ascii="Calibri" w:hAnsi="Calibri" w:eastAsia="Yu Gothic"/>
           <w:b w:val="0"/>
-          <w:color w:val="141F2B"/>
+          <w:color w:val="1C232B"/>
           <w:sz w:val="22"/>
         </w:rPr>
-        <w:t>ゲーム本編の流れをGameSceneにまとめ、各オブジェクトの役割をクラスに分けたこと</w:t>
-      </w:r>
-    </w:p>
-    <w:p>
-      <w:pPr>
-        <w:pStyle w:val="ListBullet"/>
-        <w:spacing w:after="80"/>
-      </w:pPr>
-      <w:r>
-        <w:rPr>
-          <w:rFonts w:ascii="Calibri" w:hAnsi="Calibri" w:eastAsia="Yu Gothic"/>
-          <w:b w:val="0"/>
-          <w:color w:val="141F2B"/>
-          <w:sz w:val="22"/>
-        </w:rPr>
-        <w:t>弾やファンネルをリストで管理し、寿命切れやヒット済みを削除する更新構造</w:t>
-      </w:r>
-    </w:p>
-    <w:p>
-      <w:pPr>
-        <w:pStyle w:val="ListBullet"/>
-        <w:spacing w:after="80"/>
-      </w:pPr>
-      <w:r>
-        <w:rPr>
-          <w:rFonts w:ascii="Calibri" w:hAnsi="Calibri" w:eastAsia="Yu Gothic"/>
-          <w:b w:val="0"/>
-          <w:color w:val="141F2B"/>
-          <w:sz w:val="22"/>
-        </w:rPr>
-        <w:t>HP HUD、シーン遷移、サウンド、3Dモデル描画を組み合わせ、作品として最後まで遊べる形にしたこと</w:t>
+        <w:t>GPU負荷の計測、モデル切替の回帰テスト、ステージデータ検証、ゲーム側の完了定義に沿った自動チェックを追加し、作品としての安定性を高めます。</w:t>
       </w:r>
     </w:p>
     <w:sectPr>
+      <w:footerReference w:type="default" r:id="rId11"/>
       <w:pgSz w:w="12240" w:h="15840"/>
-      <w:pgMar w:top="1440" w:right="1440" w:bottom="1440" w:left="1440" w:header="720" w:footer="720" w:gutter="0"/>
+      <w:pgMar w:top="1152" w:right="1224" w:bottom="1152" w:left="1224" w:header="720" w:footer="720" w:gutter="0"/>
       <w:cols w:space="720"/>
       <w:docGrid w:linePitch="360"/>
     </w:sectPr>
   </w:body>
 </w:document>
+</file>
+
+<file path=word/footer1.xml><?xml version="1.0" encoding="utf-8"?>
+<w:ftr xmlns:m="http://schemas.openxmlformats.org/officeDocument/2006/math" xmlns:mc="http://schemas.openxmlformats.org/markup-compatibility/2006" xmlns:mo="http://schemas.microsoft.com/office/mac/office/2008/main" xmlns:mv="urn:schemas-microsoft-com:mac:vml" xmlns:o="urn:schemas-microsoft-com:office:office" xmlns:r="http://schemas.openxmlformats.org/officeDocument/2006/relationships" xmlns:v="urn:schemas-microsoft-com:vml" xmlns:w10="urn:schemas-microsoft-com:office:word" xmlns:w14="http://schemas.microsoft.com/office/word/2010/wordml" xmlns:w="http://schemas.openxmlformats.org/wordprocessingml/2006/main" xmlns:wne="http://schemas.microsoft.com/office/word/2006/wordml" xmlns:wp14="http://schemas.microsoft.com/office/word/2010/wordprocessingDrawing" xmlns:wp="http://schemas.openxmlformats.org/drawingml/2006/wordprocessingDrawing" xmlns:wpc="http://schemas.microsoft.com/office/word/2010/wordprocessingCanvas" xmlns:wpg="http://schemas.microsoft.com/office/word/2010/wordprocessingGroup" xmlns:wpi="http://schemas.microsoft.com/office/word/2010/wordprocessingInk" xmlns:wps="http://schemas.microsoft.com/office/word/2010/wordprocessingShape" mc:Ignorable="w14 wp14">
+  <w:p>
+    <w:pPr>
+      <w:pStyle w:val="Footer"/>
+      <w:jc w:val="right"/>
+    </w:pPr>
+    <w:r>
+      <w:rPr>
+        <w:rFonts w:ascii="Calibri" w:hAnsi="Calibri" w:eastAsia="Yu Gothic"/>
+        <w:b w:val="0"/>
+        <w:color w:val="5A6470"/>
+        <w:sz w:val="16"/>
+      </w:rPr>
+      <w:t>LE3C_15_チハラ_シゴウ  |  CG2_01</w:t>
+    </w:r>
+  </w:p>
+</w:ftr>
 </file>
 
 <file path=word/numbering.xml><?xml version="1.0" encoding="utf-8"?>
@@ -1503,8 +1208,8 @@
     <w:qFormat/>
     <w:rsid w:val="00FC693F"/>
     <w:rPr>
-      <w:rFonts w:ascii="Calibri" w:hAnsi="Calibri"/>
-      <w:sz w:val="22"/>
+      <w:rFonts w:ascii="Calibri" w:hAnsi="Calibri" w:eastAsia="Yu Gothic"/>
+      <w:sz w:val="21"/>
     </w:rPr>
   </w:style>
   <w:style w:type="paragraph" w:styleId="Header">
@@ -1566,7 +1271,7 @@
       <w:outlineLvl w:val="0"/>
     </w:pPr>
     <w:rPr>
-      <w:rFonts w:asciiTheme="majorHAnsi" w:eastAsiaTheme="majorEastAsia" w:hAnsiTheme="majorHAnsi" w:cstheme="majorBidi" w:ascii="Calibri" w:hAnsi="Calibri" w:eastAsia="Yu Gothic"/>
+      <w:rFonts w:asciiTheme="majorHAnsi" w:eastAsiaTheme="majorEastAsia" w:hAnsiTheme="majorHAnsi" w:cstheme="majorBidi"/>
       <w:b/>
       <w:bCs/>
       <w:color w:val="365F91" w:themeColor="accent1" w:themeShade="BF"/>
@@ -1590,7 +1295,7 @@
       <w:outlineLvl w:val="1"/>
     </w:pPr>
     <w:rPr>
-      <w:rFonts w:asciiTheme="majorHAnsi" w:eastAsiaTheme="majorEastAsia" w:hAnsiTheme="majorHAnsi" w:cstheme="majorBidi" w:ascii="Calibri" w:hAnsi="Calibri" w:eastAsia="Yu Gothic"/>
+      <w:rFonts w:asciiTheme="majorHAnsi" w:eastAsiaTheme="majorEastAsia" w:hAnsiTheme="majorHAnsi" w:cstheme="majorBidi"/>
       <w:b/>
       <w:bCs/>
       <w:color w:val="4F81BD" w:themeColor="accent1"/>
@@ -1614,7 +1319,7 @@
       <w:outlineLvl w:val="2"/>
     </w:pPr>
     <w:rPr>
-      <w:rFonts w:asciiTheme="majorHAnsi" w:eastAsiaTheme="majorEastAsia" w:hAnsiTheme="majorHAnsi" w:cstheme="majorBidi" w:ascii="Calibri" w:hAnsi="Calibri" w:eastAsia="Yu Gothic"/>
+      <w:rFonts w:asciiTheme="majorHAnsi" w:eastAsiaTheme="majorEastAsia" w:hAnsiTheme="majorHAnsi" w:cstheme="majorBidi"/>
       <w:b/>
       <w:bCs/>
       <w:color w:val="4F81BD" w:themeColor="accent1"/>

</xml_diff>